<commit_message>
Polish plots: seaborn styling, indifference curve, weight summary
- Seaborn-inspired whitegrid theme with soft colors
- Added indifference curve (U = const) tangent to CML at complete portfolio
- Weight chart: long/short/net summary box, cleaner labels
- White marker edges, better legend framing

Generated with [Claude Code](https://claude.ai/code)
via [Happy](https://happy.engineering)

Co-Authored-By: Claude <noreply@anthropic.com>
Co-Authored-By: Happy <yesreply@happy.engineering>
</commit_message>
<xml_diff>
--- a/output/task1_report.docx
+++ b/output/task1_report.docx
@@ -4432,7 +4432,7 @@
       <w:r>
         <w:drawing>
           <wp:inline xmlns:a="http://schemas.openxmlformats.org/drawingml/2006/main" xmlns:pic="http://schemas.openxmlformats.org/drawingml/2006/picture">
-            <wp:extent cx="5029200" cy="3676546"/>
+            <wp:extent cx="5029200" cy="3639648"/>
             <wp:docPr id="1" name="Picture 1"/>
             <wp:cNvGraphicFramePr>
               <a:graphicFrameLocks noChangeAspect="1"/>
@@ -4453,7 +4453,7 @@
                   <pic:spPr>
                     <a:xfrm>
                       <a:off x="0" y="0"/>
-                      <a:ext cx="5029200" cy="3676546"/>
+                      <a:ext cx="5029200" cy="3639648"/>
                     </a:xfrm>
                     <a:prstGeom prst="rect"/>
                   </pic:spPr>
@@ -4476,7 +4476,7 @@
       <w:r>
         <w:drawing>
           <wp:inline xmlns:a="http://schemas.openxmlformats.org/drawingml/2006/main" xmlns:pic="http://schemas.openxmlformats.org/drawingml/2006/picture">
-            <wp:extent cx="5029200" cy="2777494"/>
+            <wp:extent cx="5029200" cy="2829038"/>
             <wp:docPr id="2" name="Picture 2"/>
             <wp:cNvGraphicFramePr>
               <a:graphicFrameLocks noChangeAspect="1"/>
@@ -4497,7 +4497,7 @@
                   <pic:spPr>
                     <a:xfrm>
                       <a:off x="0" y="0"/>
-                      <a:ext cx="5029200" cy="2777494"/>
+                      <a:ext cx="5029200" cy="2829038"/>
                     </a:xfrm>
                     <a:prstGeom prst="rect"/>
                   </pic:spPr>

</xml_diff>